<commit_message>
Docs: documentar el error model_not_found de Groq y como resolverlo
Agrega una fila a la tabla de 'Errores comunes' del README y del docx
de la guia del estudiante, con el comando de diagnostico
(curl .../v1/models) para que cualquiera pueda resolverlo sin
depender de que el modelo pineado siga vigente en el futuro.
</commit_message>
<xml_diff>
--- a/unidad1/Guia_Paso_a_Paso_Estudiante_Unidad1.docx
+++ b/unidad1/Guia_Paso_a_Paso_Estudiante_Unidad1.docx
@@ -1169,6 +1169,44 @@
           </w:p>
         </w:tc>
       </w:tr>
+      <w:tr>
+        <w:tc>
+          <w:tcPr>
+            <w:tcW w:type="dxa" w:w="3402"/>
+          </w:tcPr>
+          <w:p>
+            <w:pPr>
+              <w:spacing w:line="276" w:lineRule="auto"/>
+            </w:pPr>
+            <w:r/>
+            <w:r>
+              <w:rPr>
+                <w:rFonts w:ascii="Arial" w:hAnsi="Arial"/>
+                <w:sz w:val="21"/>
+              </w:rPr>
+              <w:t>Error code: 404 ... model_not_found (rama Groq)</w:t>
+            </w:r>
+          </w:p>
+        </w:tc>
+        <w:tc>
+          <w:tcPr>
+            <w:tcW w:type="dxa" w:w="5386"/>
+          </w:tcPr>
+          <w:p>
+            <w:pPr>
+              <w:spacing w:line="276" w:lineRule="auto"/>
+            </w:pPr>
+            <w:r/>
+            <w:r>
+              <w:rPr>
+                <w:rFonts w:ascii="Arial" w:hAnsi="Arial"/>
+                <w:sz w:val="21"/>
+              </w:rPr>
+              <w:t>El catálogo de modelos de Groq cambia con el tiempo y el modelo pineado puede haber sido discontinuado. Corré en la terminal: curl -s -H "Authorization: Bearer $GROQ_API_KEY" https://api.groq.com/openai/v1/models (no expone tu key en el resultado). Elegí un id vigente de la respuesta y reemplazá GROQ_MODEL_NAME en src/providers/groq_provider.py por ese valor.</w:t>
+            </w:r>
+          </w:p>
+        </w:tc>
+      </w:tr>
     </w:tbl>
     <w:p>
       <w:pPr>

</xml_diff>

<commit_message>
Fix: flujo de Colab sin Drive, usando integracion nativa con GitHub
El README decia 'abrilo directo desde GitHub con Abrir en Colab' pero
el notebook no tenia ningun badge/boton de Colab embebido, y un badge
fijo hubiera apuntado siempre al repo de la catedra en vez del fork
de cada estudiante.

Reemplazado por el flujo correcto: Archivo -> Abrir notebook -> pestana
GitHub (o URL directa con el propio usuario) para abrir sin pasar por
Drive, y Archivo -> Guardar una copia en GitHub para commitear el
notebook ejecutado directo al fork, sin descarga/subida manual.

Aplicado en unidad1/README.md y en el docx de la guia del estudiante.
</commit_message>
<xml_diff>
--- a/unidad1/Guia_Paso_a_Paso_Estudiante_Unidad1.docx
+++ b/unidad1/Guia_Paso_a_Paso_Estudiante_Unidad1.docx
@@ -1245,6 +1245,16 @@
       </w:r>
     </w:p>
     <w:p>
+      <w:r>
+        <w:rPr>
+          <w:rFonts w:ascii="Arial" w:hAnsi="Arial"/>
+          <w:i w:val="0"/>
+          <w:sz w:val="22"/>
+        </w:rPr>
+        <w:t>Colab tiene integración nativa con GitHub: no hace falta subir nada a Google Drive en ningún paso de esta sección.</w:t>
+      </w:r>
+    </w:p>
+    <w:p>
       <w:pPr>
         <w:spacing w:before="200" w:after="160" w:line="276" w:lineRule="auto"/>
         <w:jc w:val="left"/>
@@ -1256,7 +1266,7 @@
           <w:color w:val="1F4E79"/>
           <w:sz w:val="25"/>
         </w:rPr>
-        <w:t>4.1 Abrir el notebook en Colab</w:t>
+        <w:t>4.1 Abrir el notebook desde tu fork (sin usar Drive)</w:t>
       </w:r>
     </w:p>
     <w:p>
@@ -1270,7 +1280,7 @@
           <w:rFonts w:ascii="Arial" w:hAnsi="Arial"/>
           <w:sz w:val="22"/>
         </w:rPr>
-        <w:t>Desde tu repositorio forkeado en GitHub, abrí notebooks/notebook_peft.ipynb.</w:t>
+        <w:t>Entrá a colab.research.google.com → Archivo → Abrir notebook → pestaña GitHub.</w:t>
       </w:r>
     </w:p>
     <w:p>
@@ -1284,7 +1294,7 @@
           <w:rFonts w:ascii="Arial" w:hAnsi="Arial"/>
           <w:sz w:val="22"/>
         </w:rPr>
-        <w:t>Usá el botón "Open in Colab" (o subilo manualmente a Google Colab desde tu Google Drive).</w:t>
+        <w:t>Pegá la URL de tu propio repositorio forkeado (o buscá tu usuario y el nombre del repo).</w:t>
       </w:r>
     </w:p>
     <w:p>
@@ -1298,7 +1308,55 @@
           <w:rFonts w:ascii="Arial" w:hAnsi="Arial"/>
           <w:sz w:val="22"/>
         </w:rPr>
-        <w:t>En Colab, andá a Entorno de ejecución → Cambiar tipo de entorno de ejecución → GPU (T4) y guardá.</w:t>
+        <w:t>Seleccioná unidad1/notebooks/notebook_peft.ipynb de la lista.</w:t>
+      </w:r>
+    </w:p>
+    <w:p>
+      <w:r>
+        <w:rPr>
+          <w:rFonts w:ascii="Arial" w:hAnsi="Arial"/>
+          <w:i w:val="0"/>
+          <w:sz w:val="22"/>
+        </w:rPr>
+        <w:t>Alternativa más rápida: armá la URL directo en el navegador, reemplazando TU-USUARIO por tu usuario de GitHub:</w:t>
+      </w:r>
+    </w:p>
+    <w:p>
+      <w:pPr>
+        <w:spacing w:line="276" w:lineRule="auto" w:before="80" w:after="200"/>
+        <w:ind w:left="283"/>
+        <w:jc w:val="left"/>
+        <w:shd w:val="clear" w:fill="F2F2F2"/>
+      </w:pPr>
+      <w:r>
+        <w:rPr>
+          <w:rFonts w:ascii="Consolas" w:hAnsi="Consolas"/>
+          <w:color w:val="202020"/>
+          <w:sz w:val="20"/>
+        </w:rPr>
+        <w:t>https://colab.research.google.com/github/TU-USUARIO/ucaece-sem-cd2-act/</w:t>
+        <w:br/>
+        <w:t>blob/master/unidad1/notebooks/notebook_peft.ipynb</w:t>
+      </w:r>
+    </w:p>
+    <w:p>
+      <w:r>
+        <w:rPr>
+          <w:rFonts w:ascii="Arial" w:hAnsi="Arial"/>
+          <w:i w:val="0"/>
+          <w:sz w:val="22"/>
+        </w:rPr>
+        <w:t>Importante: abrí tu fork, no el repositorio de la cátedra. Si abrís el original vas a estar trabajando sobre la plantilla y no sobre tu copia.</w:t>
+      </w:r>
+    </w:p>
+    <w:p>
+      <w:r>
+        <w:rPr>
+          <w:rFonts w:ascii="Arial" w:hAnsi="Arial"/>
+          <w:i w:val="0"/>
+          <w:sz w:val="22"/>
+        </w:rPr>
+        <w:t>En Colab, activá GPU: Entorno de ejecución → Cambiar tipo de entorno de ejecución → GPU (T4).</w:t>
       </w:r>
     </w:p>
     <w:p>
@@ -1398,7 +1456,7 @@
           <w:rFonts w:ascii="Arial" w:hAnsi="Arial"/>
           <w:sz w:val="22"/>
         </w:rPr>
-        <w:t>En Colab, andá a Archivo → Descargar → Descargar .ipynb (con las salidas/outputs ya generados).</w:t>
+        <w:t>En Colab, andá a Archivo → Guardar una copia en GitHub.</w:t>
       </w:r>
     </w:p>
     <w:p>
@@ -1412,7 +1470,7 @@
           <w:rFonts w:ascii="Arial" w:hAnsi="Arial"/>
           <w:sz w:val="22"/>
         </w:rPr>
-        <w:t>En tu Codespace, reemplazá notebooks/notebook_peft.ipynb por el archivo descargado (podés arrastrarlo al explorador de archivos o subirlo por la terminal).</w:t>
+        <w:t>La primera vez, Colab te va a pedir autorizar la conexión con tu cuenta de GitHub: aceptá.</w:t>
       </w:r>
     </w:p>
     <w:p>
@@ -1426,7 +1484,31 @@
           <w:rFonts w:ascii="Arial" w:hAnsi="Arial"/>
           <w:sz w:val="22"/>
         </w:rPr>
-        <w:t>Commiteá el notebook actualizado junto con el resto de tu entrega (ver sección 5).</w:t>
+        <w:t>Elegí tu repositorio forkeado, la rama master, y confirmá que la ruta del archivo sea unidad1/notebooks/notebook_peft.ipynb (la misma que abriste).</w:t>
+      </w:r>
+    </w:p>
+    <w:p>
+      <w:pPr>
+        <w:pStyle w:val="ListNumber"/>
+        <w:spacing w:line="360" w:lineRule="auto" w:after="80"/>
+        <w:jc w:val="both"/>
+      </w:pPr>
+      <w:r>
+        <w:rPr>
+          <w:rFonts w:ascii="Arial" w:hAnsi="Arial"/>
+          <w:sz w:val="22"/>
+        </w:rPr>
+        <w:t>Confirmá. Colab commitea el notebook con las salidas (outputs) ya generadas directo a tu repositorio, sin pasar por Drive ni por el Codespace.</w:t>
+      </w:r>
+    </w:p>
+    <w:p>
+      <w:r>
+        <w:rPr>
+          <w:rFonts w:ascii="Arial" w:hAnsi="Arial"/>
+          <w:i w:val="0"/>
+          <w:sz w:val="22"/>
+        </w:rPr>
+        <w:t>Si preferís no autorizar la conexión Colab-GitHub, la alternativa manual es: Archivo → Descargar → Descargar .ipynb, y luego reemplazar el archivo en tu Codespace (arrastrándolo al explorador de archivos) para commitearlo junto con el resto de tu entrega.</w:t>
       </w:r>
     </w:p>
     <w:p>
@@ -1573,7 +1655,7 @@
           <w:i w:val="0"/>
           <w:sz w:val="22"/>
         </w:rPr>
-        <w:t>El Codespace ya viene autenticado con tu cuenta de GitHub, así que el push va directo a tu repositorio forkeado sin configuración adicional.</w:t>
+        <w:t>El Codespace ya viene autenticado con tu cuenta de GitHub, así que el push va directo a tu repositorio forkeado sin configuración adicional. Si guardaste el notebook con "Guardar una copia en GitHub" desde Colab (sección 4.3), ese commit ya está en tu fork y no hace falta subirlo de nuevo desde acá.</w:t>
       </w:r>
     </w:p>
     <w:p>

</xml_diff>